<commit_message>
Atualiza portfolio para desenvolvedor formado
</commit_message>
<xml_diff>
--- a/assets/resume/Curriculo_Tiago_Martins.docx
+++ b/assets/resume/Curriculo_Tiago_Martins.docx
@@ -29,7 +29,7 @@
           <w:color w:val="14747B"/>
           <w:sz w:val="23"/>
         </w:rPr>
-        <w:t>DESENVOLVEDOR FULL STACK EM FORMAÇÃO</w:t>
+        <w:t>DESENVOLVEDOR FULL STACK</w:t>
       </w:r>
     </w:p>
     <w:p>
@@ -133,7 +133,7 @@
           <w:color w:val="23282D"/>
           <w:sz w:val="19"/>
         </w:rPr>
-        <w:t>Estudante de Análise e Desenvolvimento de Sistemas com foco em desenvolvimento Full Stack. Experiência prática na criação de aplicações web e mobile com React, React Native, Node.js, APIs REST e bancos de dados relacionais. Perfil curioso, organizado e orientado à resolução de problemas, com vivência anterior em logística, almoxarifado e atendimento técnico.</w:t>
+        <w:t>Desenvolvedor Full Stack formado em Análise e Desenvolvimento de Sistemas. Experiência prática na criação de aplicações web e mobile com React, React Native, Node.js, APIs REST e bancos de dados relacionais. Perfil curioso, organizado e orientado à resolução de problemas, com vivência anterior em logística, almoxarifado e atendimento técnico.</w:t>
       </w:r>
     </w:p>
     <w:p>
@@ -686,7 +686,7 @@
           <w:color w:val="14747B"/>
           <w:sz w:val="19"/>
         </w:rPr>
-        <w:t xml:space="preserve"> — cursando</w:t>
+        <w:t xml:space="preserve"> — concluído</w:t>
       </w:r>
     </w:p>
     <w:p>

</xml_diff>

<commit_message>
Atualiza curriculo e textos do portfolio
</commit_message>
<xml_diff>
--- a/assets/resume/Curriculo_Tiago_Martins.docx
+++ b/assets/resume/Curriculo_Tiago_Martins.docx
@@ -133,7 +133,7 @@
           <w:color w:val="23282D"/>
           <w:sz w:val="19"/>
         </w:rPr>
-        <w:t>Desenvolvedor Full Stack formado em Análise e Desenvolvimento de Sistemas. Experiência prática na criação de aplicações web e mobile com React, React Native, Node.js, APIs REST e bancos de dados relacionais. Perfil curioso, organizado e orientado à resolução de problemas, com vivência anterior em logística, almoxarifado e atendimento técnico.</w:t>
+        <w:t>Desenvolvedor Full Stack e Técnico em Desenvolvimento de Sistemas, cursando Análise e Desenvolvimento de Sistemas. Experiência prática na criação de aplicações web e mobile com React, React Native, Node.js, APIs REST e bancos de dados relacionais. Perfil curioso, organizado e orientado à resolução de problemas, com vivência anterior em logística, almoxarifado e atendimento técnico.</w:t>
       </w:r>
     </w:p>
     <w:p>
@@ -686,7 +686,7 @@
           <w:color w:val="14747B"/>
           <w:sz w:val="19"/>
         </w:rPr>
-        <w:t xml:space="preserve"> — concluído</w:t>
+        <w:t xml:space="preserve"> — em andamento</w:t>
       </w:r>
     </w:p>
     <w:p>
@@ -701,7 +701,7 @@
           <w:color w:val="5B636B"/>
           <w:sz w:val="19"/>
         </w:rPr>
-        <w:t>Formação complementar anterior: Técnico em Desenvolvimento de Sistemas.</w:t>
+        <w:t>Técnico em Desenvolvimento de Sistemas — concluído</w:t>
       </w:r>
     </w:p>
     <w:p>

</xml_diff>